<commit_message>
reverted apaquarto version due to formatting issues
</commit_message>
<xml_diff>
--- a/_extensions/wjschne/apaquarto/apaquarto.docx
+++ b/_extensions/wjschne/apaquarto/apaquarto.docx
@@ -4,7 +4,7 @@
   <w:body>
     <w:p>
       <w:pPr>
-        <w:pStyle w:val="SubPanelNote"/>
+        <w:pStyle w:val="AbstractFirstParagraph"/>
       </w:pPr>
     </w:p>
     <w:sectPr>
@@ -14,7 +14,7 @@
       <w:footerReference w:type="default" r:id="rId11"/>
       <w:headerReference w:type="first" r:id="rId12"/>
       <w:footerReference w:type="first" r:id="rId13"/>
-      <w:pgSz w:w="12240" w:h="15840" w:code="1"/>
+      <w:pgSz w:w="12240" w:h="15840"/>
       <w:pgMar w:top="1440" w:right="1440" w:bottom="1440" w:left="1440" w:header="720" w:footer="720" w:gutter="0"/>
       <w:cols w:space="720"/>
     </w:sectPr>
@@ -108,7 +108,6 @@
         <w:tab w:val="right" w:pos="9360"/>
       </w:tabs>
     </w:pPr>
-    <!-- apaquarto-original-runninghead: <w:sdt><w:sdtPr><w:alias w:val="Comments"/><w:tag w:val=""/><w:id w:val="411821190"/><w:placeholder><w:docPart w:val="0C02FC99099648D19246354A6487E13A"/></w:placeholder><w:showingPlcHdr/><w:dataBinding w:prefixMappings="xmlns:ns0='http://purl.org/dc/elements/1.1/' xmlns:ns1='http://schemas.openxmlformats.org/package/2006/metadata/core-properties' " w:xpath="/ns1:coreProperties[1]/ns0:description[1]" w:storeItemID="{6C3C8BC8-F283-45AE-878A-BAB7291924A1}"/><w:text w:multiLine="1"/></w:sdtPr><w:sdtContent><w:r><w:rPr><w:rStyle w:val="PlaceholderText"/></w:rPr><w:t>[Comments]</w:t></w:r></w:sdtContent></w:sdt> -->
     <w:sdt>
       <w:sdtPr>
         <w:alias w:val="Comments"/>
@@ -117,12 +116,16 @@
         <w:placeholder>
           <w:docPart w:val="0C02FC99099648D19246354A6487E13A"/>
         </w:placeholder>
+        <w:showingPlcHdr/>
         <w:dataBinding w:prefixMappings="xmlns:ns0='http://purl.org/dc/elements/1.1/' xmlns:ns1='http://schemas.openxmlformats.org/package/2006/metadata/core-properties' " w:xpath="/ns1:coreProperties[1]/ns0:description[1]" w:storeItemID="{6C3C8BC8-F283-45AE-878A-BAB7291924A1}"/>
         <w:text w:multiLine="1"/>
       </w:sdtPr>
       <w:sdtContent>
         <w:r>
-          <w:t xml:space="preserve">QUANTIFYING METACOGNITION WITH hmetad</w:t>
+          <w:rPr>
+            <w:rStyle w:val="PlaceholderText"/>
+          </w:rPr>
+          <w:t>[Comments]</w:t>
         </w:r>
       </w:sdtContent>
     </w:sdt>
@@ -1179,9 +1182,9 @@
     <w:uiPriority w:val="9"/>
     <w:unhideWhenUsed/>
     <w:qFormat/>
-    <w:rsid w:val="0056007C"/>
-    <w:pPr>
-      <w:ind w:left="720" w:firstLine="0"/>
+    <w:rsid w:val="0017682D"/>
+    <w:pPr>
+      <w:ind w:left="720" w:right="720" w:firstLine="0"/>
     </w:pPr>
   </w:style>
   <w:style w:type="paragraph" w:styleId="FootnoteText">
@@ -1190,10 +1193,6 @@
     <w:uiPriority w:val="9"/>
     <w:unhideWhenUsed/>
     <w:qFormat/>
-    <w:rsid w:val="00780A8B"/>
-    <w:pPr>
-      <w:spacing w:line="240" w:lineRule="auto"/>
-    </w:pPr>
   </w:style>
   <w:style w:type="table" w:customStyle="1" w:styleId="Table">
     <w:name w:val="Table"/>
@@ -1202,7 +1201,7 @@
     <w:qFormat/>
     <w:rsid w:val="00387689"/>
     <w:pPr>
-      <w:spacing w:before="0" w:after="0"/>
+      <w:spacing w:before="60" w:after="60"/>
     </w:pPr>
     <w:tblPr>
       <w:tblInd w:w="0" w:type="dxa"/>
@@ -1210,14 +1209,14 @@
         <w:bottom w:val="single" w:sz="4" w:space="0" w:color="auto"/>
       </w:tblBorders>
       <w:tblCellMar>
-        <w:top w:w="138" w:type="dxa"/>
+        <w:top w:w="58" w:type="dxa"/>
         <w:left w:w="58" w:type="dxa"/>
-        <w:bottom w:w="138" w:type="dxa"/>
+        <w:bottom w:w="58" w:type="dxa"/>
         <w:right w:w="58" w:type="dxa"/>
       </w:tblCellMar>
     </w:tblPr>
     <w:tcPr>
-      <w:vAlign w:val="top"/>
+      <w:vAlign w:val="center"/>
     </w:tcPr>
     <w:tblStylePr w:type="firstRow">
       <w:tblPr/>
@@ -1232,11 +1231,6 @@
           <w:tl2br w:val="nil"/>
           <w:tr2bl w:val="nil"/>
         </w:tcBorders>
-        <w:tcMar>
-          <w:top w:w="186" w:type="dxa"/>
-          <w:bottom w:w="138" w:type="dxa"/>
-        </w:tcMar>
-        <w:vAlign w:val="bottom"/>
       </w:tcPr>
     </w:tblStylePr>
   </w:style>
@@ -1264,7 +1258,7 @@
     <w:pPr>
       <w:keepNext/>
       <w:keepLines/>
-      <w:spacing w:after="0"/>
+      <w:spacing w:after="120"/>
     </w:pPr>
     <w:rPr>
       <w:i/>
@@ -1273,9 +1267,6 @@
   <w:style w:type="paragraph" w:customStyle="1" w:styleId="TableCaption">
     <w:name w:val="Table Caption"/>
     <w:basedOn w:val="Caption"/>
-    <w:pPr>
-      <w:spacing w:after="0"/>
-    </w:pPr>
   </w:style>
   <w:style w:type="paragraph" w:customStyle="1" w:styleId="ImageCaption">
     <w:name w:val="Image Caption"/>
@@ -1805,7 +1796,8 @@
     <w:pPr>
       <w:keepNext/>
       <w:keepLines/>
-      <w:spacing w:before="552" w:line="480" w:lineRule="auto"/>
+      <w:spacing w:line="480" w:lineRule="auto"/>
+      <w:outlineLvl w:val="0"/>
     </w:pPr>
     <w:rPr>
       <w:b/>
@@ -1833,7 +1825,7 @@
     <w:qFormat/>
     <w:rsid w:val="00A946AC"/>
     <w:pPr>
-      <w:spacing w:before="260"/>
+      <w:spacing w:before="60"/>
       <w:ind w:firstLine="0"/>
     </w:pPr>
   </w:style>
@@ -1872,7 +1864,7 @@
     <w:qFormat/>
     <w:rsid w:val="00C304F7"/>
     <w:pPr>
-      <w:spacing w:after="0"/>
+      <w:spacing w:after="240"/>
     </w:pPr>
   </w:style>
   <w:style w:type="character" w:customStyle="1" w:styleId="FigureWithoutNoteChar">
@@ -1901,7 +1893,7 @@
     <w:qFormat/>
     <w:rsid w:val="00BB3FEC"/>
     <w:pPr>
-      <w:spacing w:before="552"/>
+      <w:spacing w:before="240"/>
     </w:pPr>
   </w:style>
   <w:style w:type="character" w:customStyle="1" w:styleId="AfterWithoutNoteChar">
@@ -1941,7 +1933,7 @@
     <w:basedOn w:val="BodyTextChar"/>
     <w:link w:val="BlockText"/>
     <w:uiPriority w:val="9"/>
-    <w:rsid w:val="0056007C"/>
+    <w:rsid w:val="00065938"/>
   </w:style>
   <w:style w:type="character" w:customStyle="1" w:styleId="NextBlockTextChar">
     <w:name w:val="NextBlockText Char"/>
@@ -2006,77 +1998,6 @@
     <w:rPr>
       <w:szCs w:val="20"/>
     </w:rPr>
-  </w:style>
-  <w:style w:type="paragraph" w:customStyle="1" w:styleId="SubPanelNote">
-    <w:name w:val="SubPanelNote"/>
-    <w:basedOn w:val="FigureNote"/>
-    <w:link w:val="SubPanelNoteChar"/>
-    <w:qFormat/>
-    <w:rsid w:val="00BD5312"/>
-    <w:pPr>
-      <w:jc w:val="center"/>
-    </w:pPr>
-  </w:style>
-  <w:style w:type="character" w:customStyle="1" w:styleId="SubPanelNoteChar">
-    <w:name w:val="SubPanelNote Char"/>
-    <w:basedOn w:val="FigureNoteChar"/>
-    <w:link w:val="SubPanelNote"/>
-    <w:rsid w:val="00BD5312"/>
-  </w:style>
-  <w:style w:type="paragraph" w:customStyle="1" w:styleId="ApaUnlistedHeading1">
-    <w:name w:val="Apa Unlisted Heading 1"/>
-    <w:basedOn w:val="Heading1"/>
-    <w:qFormat/>
-    <w:pPr>
-      <w:outlineLvl w:val="9"/>
-    </w:pPr>
-  </w:style>
-  <w:style w:type="paragraph" w:customStyle="1" w:styleId="ApaUnlistedHeading2">
-    <w:name w:val="Apa Unlisted Heading 2"/>
-    <w:basedOn w:val="Heading2"/>
-    <w:qFormat/>
-    <w:pPr>
-      <w:outlineLvl w:val="9"/>
-    </w:pPr>
-  </w:style>
-  <w:style w:type="paragraph" w:customStyle="1" w:styleId="ApaUnlistedHeading3">
-    <w:name w:val="Apa Unlisted Heading 3"/>
-    <w:basedOn w:val="Heading3"/>
-    <w:qFormat/>
-    <w:pPr>
-      <w:outlineLvl w:val="9"/>
-    </w:pPr>
-  </w:style>
-  <w:style w:type="paragraph" w:customStyle="1" w:styleId="ApaUnlistedHeading4">
-    <w:name w:val="Apa Unlisted Heading 4"/>
-    <w:basedOn w:val="Heading4"/>
-    <w:qFormat/>
-    <w:pPr>
-      <w:outlineLvl w:val="9"/>
-    </w:pPr>
-  </w:style>
-  <w:style w:type="paragraph" w:customStyle="1" w:styleId="ApaUnlistedHeading5">
-    <w:name w:val="Apa Unlisted Heading 5"/>
-    <w:basedOn w:val="Heading5"/>
-    <w:qFormat/>
-    <w:pPr>
-      <w:outlineLvl w:val="9"/>
-    </w:pPr>
-  </w:style>
-  <w:style w:type="paragraph" w:customStyle="1" w:styleId="ApaUnlistedHeading6">
-    <w:name w:val="Apa Unlisted Heading 6"/>
-    <w:basedOn w:val="Heading6"/>
-    <w:qFormat/>
-    <w:pPr>
-      <w:outlineLvl w:val="9"/>
-    </w:pPr>
-  </w:style>
-  <w:style w:type="paragraph" w:customStyle="1" w:styleId="QuoteAttribution">
-    <w:name w:val="QuoteAttribution"/>
-    <w:basedOn w:val="BlockText"/>
-    <w:pPr>
-      <w:jc w:val="right"/>
-    </w:pPr>
   </w:style>
 </w:styles>
 </file>
@@ -2175,25 +2096,19 @@
     <w:rsid w:val="00221DB6"/>
     <w:rsid w:val="00266742"/>
     <w:rsid w:val="002E7A3C"/>
-    <w:rsid w:val="003106FC"/>
     <w:rsid w:val="003402EC"/>
     <w:rsid w:val="00440287"/>
     <w:rsid w:val="004739F0"/>
     <w:rsid w:val="004F6D10"/>
     <w:rsid w:val="005702F2"/>
     <w:rsid w:val="005B1707"/>
-    <w:rsid w:val="005C0DD9"/>
     <w:rsid w:val="0061553F"/>
-    <w:rsid w:val="006F54D0"/>
     <w:rsid w:val="007139D3"/>
     <w:rsid w:val="00843AF0"/>
-    <w:rsid w:val="0088292B"/>
-    <w:rsid w:val="00AA6B78"/>
     <w:rsid w:val="00B139B1"/>
     <w:rsid w:val="00B34FB5"/>
     <w:rsid w:val="00CE12A2"/>
     <w:rsid w:val="00D34E1D"/>
-    <w:rsid w:val="00DE61F2"/>
     <w:rsid w:val="00E37D61"/>
     <w:rsid w:val="00FC515E"/>
   </w:rsids>

</xml_diff>